<commit_message>
fix(reports): resolve header placeholders, CES table alignment, and native Word PDF generation
</commit_message>
<xml_diff>
--- a/report-templates/Attainx_Laboratory_PR_OR_Template.docx
+++ b/report-templates/Attainx_Laboratory_PR_OR_Template.docx
@@ -487,19 +487,7 @@
                 <w:szCs w:val="24"/>
                 <w:u w:val="single"/>
               </w:rPr>
-              <w:t xml:space="preserve">Academic </w:t>
-            </w:r>
-            <w:r>
-              <w:rPr>
-                <w:rFonts w:ascii="Times New Roman" w:eastAsia="Times New Roman" w:hAnsi="Times New Roman"/>
-                <w:b/>
-                <w:bCs/>
-                <w:color w:val="000000"/>
-                <w:sz w:val="24"/>
-                <w:szCs w:val="24"/>
-                <w:u w:val="single"/>
-              </w:rPr>
-              <w:t>Year</w:t>
+              <w:t xml:space="preserve">Academic Year : {{ACADEMIC_YEAR}}</w:t>
             </w:r>
           </w:p>
         </w:tc>
@@ -560,7 +548,7 @@
                 <w:sz w:val="24"/>
                 <w:szCs w:val="24"/>
               </w:rPr>
-              <w:tab/>
+              <w:t>{{COURSE_NAME}}</w:t>
             </w:r>
           </w:p>
         </w:tc>
@@ -4045,7 +4033,7 @@
                 <w:sz w:val="24"/>
                 <w:szCs w:val="24"/>
               </w:rPr>
-              <w:t xml:space="preserve">O Attainment - Academic Year {{ACADEMIC_YEAR}}________                     </w:t>
+              <w:t xml:space="preserve">O Attainment - Academic Year {{ACADEMIC_YEAR}}                     </w:t>
             </w:r>
           </w:p>
         </w:tc>
@@ -6207,7 +6195,7 @@
     </w:p>
     <w:tbl>
       <w:tblPr>
-        <w:tblW w:w="9889" w:type="dxa"/>
+        <w:tblW w:w="9360" w:type="dxa"/>
         <w:tblBorders>
           <w:top w:val="single" w:sz="4" w:space="0" w:color="000000"/>
           <w:left w:val="single" w:sz="4" w:space="0" w:color="000000"/>
@@ -6223,7 +6211,7 @@
         <w:gridCol w:w="833"/>
         <w:gridCol w:w="1057"/>
         <w:gridCol w:w="900"/>
-        <w:gridCol w:w="6271"/>
+        <w:gridCol w:w="5742"/>
       </w:tblGrid>
       <w:tr>
         <w:tc>
@@ -6380,7 +6368,7 @@
         </w:tc>
         <w:tc>
           <w:tcPr>
-            <w:tcW w:w="6271" w:type="dxa"/>
+            <w:tcW w:w="5742" w:type="dxa"/>
             <w:vAlign w:val="center"/>
           </w:tcPr>
           <w:p>
@@ -6508,7 +6496,7 @@
         </w:tc>
         <w:tc>
           <w:tcPr>
-            <w:tcW w:w="6271" w:type="dxa"/>
+            <w:tcW w:w="5742" w:type="dxa"/>
             <w:vAlign w:val="center"/>
           </w:tcPr>
           <w:p>
@@ -6727,7 +6715,7 @@
         </w:tc>
         <w:tc>
           <w:tcPr>
-            <w:tcW w:w="6271" w:type="dxa"/>
+            <w:tcW w:w="5742" w:type="dxa"/>
           </w:tcPr>
           <w:p>
             <w:pPr>
@@ -6836,7 +6824,7 @@
         </w:tc>
         <w:tc>
           <w:tcPr>
-            <w:tcW w:w="6271" w:type="dxa"/>
+            <w:tcW w:w="5742" w:type="dxa"/>
           </w:tcPr>
           <w:p>
             <w:pPr>
@@ -6945,7 +6933,7 @@
         </w:tc>
         <w:tc>
           <w:tcPr>
-            <w:tcW w:w="6271" w:type="dxa"/>
+            <w:tcW w:w="5742" w:type="dxa"/>
           </w:tcPr>
           <w:p>
             <w:pPr>
@@ -7054,7 +7042,7 @@
         </w:tc>
         <w:tc>
           <w:tcPr>
-            <w:tcW w:w="6271" w:type="dxa"/>
+            <w:tcW w:w="5742" w:type="dxa"/>
           </w:tcPr>
           <w:p>
             <w:pPr>
@@ -7163,7 +7151,7 @@
         </w:tc>
         <w:tc>
           <w:tcPr>
-            <w:tcW w:w="6271" w:type="dxa"/>
+            <w:tcW w:w="5742" w:type="dxa"/>
           </w:tcPr>
           <w:p>
             <w:pPr>
@@ -7272,7 +7260,7 @@
         </w:tc>
         <w:tc>
           <w:tcPr>
-            <w:tcW w:w="6271" w:type="dxa"/>
+            <w:tcW w:w="5742" w:type="dxa"/>
           </w:tcPr>
           <w:p>
             <w:pPr>

</xml_diff>